<commit_message>
Danh dau cho sua trong v12: to nen vang + danh muc sua doi o trang dau
Ban truoc va dung noi dung nhung khong danh dau, nen khong the tim ra cho sua
giua 16.606 tu. Bo sung hai thu:

* Moi doan va o bang bi cham vao duoc to nen vang (37 run tai 17 vi tri).
* Mot bang "DANH MUC SUA DOI SO VOI BAN v11" chen o DAU tai lieu, liet ke 11
  muc sua kem ly do. Phai chen truoc phan tu dau tien cua body chu khong phai
  truoc doan van dau tien: trang bia v11 la mot bang nam truoc moi doan van.

`--no-highlight` sinh ban nop: khong to nen, khong danh muc.

Kem theo mot loi thut le: `return made` cua insert_after bi rot vao trong vong
lap nen ham tra ve sau doan dau tien. Chua gay hau qua vi moi loi goi hien tai
chi chen mot doan, nhung da sua.

296 test pass.
</commit_message>
<xml_diff>
--- a/docs/De_an_thac_si_v12.docx
+++ b/docs/De_an_thac_si_v12.docx
@@ -2,6 +2,433 @@
 <file path=word/document.xml><?xml version="1.0" encoding="utf-8"?>
 <w:document xmlns:wpc="http://schemas.microsoft.com/office/word/2010/wordprocessingCanvas" xmlns:cx="http://schemas.microsoft.com/office/drawing/2014/chartex" xmlns:cx1="http://schemas.microsoft.com/office/drawing/2015/9/8/chartex" xmlns:mc="http://schemas.openxmlformats.org/markup-compatibility/2006" xmlns:o="urn:schemas-microsoft-com:office:office" xmlns:r="http://schemas.openxmlformats.org/officeDocument/2006/relationships" xmlns:m="http://schemas.openxmlformats.org/officeDocument/2006/math" xmlns:v="urn:schemas-microsoft-com:vml" xmlns:wp14="http://schemas.microsoft.com/office/word/2010/wordprocessingDrawing" xmlns:wp="http://schemas.openxmlformats.org/drawingml/2006/wordprocessingDrawing" xmlns:w10="urn:schemas-microsoft-com:office:word" xmlns:w="http://schemas.openxmlformats.org/wordprocessingml/2006/main" xmlns:w14="http://schemas.microsoft.com/office/word/2010/wordml" xmlns:w15="http://schemas.microsoft.com/office/word/2012/wordml" xmlns:w16se="http://schemas.microsoft.com/office/word/2015/wordml/symex" xmlns:wpg="http://schemas.microsoft.com/office/word/2010/wordprocessingGroup" xmlns:wpi="http://schemas.microsoft.com/office/word/2010/wordprocessingInk" xmlns:wne="http://schemas.microsoft.com/office/word/2006/wordml" xmlns:wps="http://schemas.microsoft.com/office/word/2010/wordprocessingShape" mc:Ignorable="w14 w15 w16se wp14">
   <w:body>
+    <w:p>
+      <w:pPr>
+        <w:pStyle w:val="Heading1"/>
+      </w:pPr>
+      <w:r>
+        <w:t>DANH MỤC SỬA ĐỔI SO VỚI BẢN v11</w:t>
+      </w:r>
+    </w:p>
+    <w:p>
+      <w:pPr>
+        <w:jc w:val="both"/>
+      </w:pPr>
+      <w:r>
+        <w:t>Toàn bộ phần được sửa hoặc thêm mới đã được tô nền vàng trong tài liệu. Trang này và phần tô nền chỉ phục vụ việc rà soát; bản nộp cuối cùng được sinh lại bằng tuỳ chọn --no-highlight để trả lại nền trắng.</w:t>
+      </w:r>
+    </w:p>
+    <w:tbl>
+      <w:tblPr>
+        <w:tblStyle w:val="TableGrid"/>
+        <w:tblW w:type="auto" w:w="0"/>
+        <w:tblLook w:firstColumn="1" w:firstRow="1" w:lastColumn="0" w:lastRow="0" w:noHBand="0" w:noVBand="1" w:val="04A0"/>
+      </w:tblPr>
+      <w:tblGrid>
+        <w:gridCol w:w="2929"/>
+        <w:gridCol w:w="2929"/>
+        <w:gridCol w:w="2929"/>
+      </w:tblGrid>
+      <w:tr>
+        <w:tc>
+          <w:tcPr>
+            <w:tcW w:type="dxa" w:w="2929"/>
+          </w:tcPr>
+          <w:p>
+            <w:r/>
+            <w:r>
+              <w:rPr>
+                <w:b/>
+              </w:rPr>
+              <w:t>Mục</w:t>
+            </w:r>
+          </w:p>
+        </w:tc>
+        <w:tc>
+          <w:tcPr>
+            <w:tcW w:type="dxa" w:w="2929"/>
+          </w:tcPr>
+          <w:p>
+            <w:r/>
+            <w:r>
+              <w:rPr>
+                <w:b/>
+              </w:rPr>
+              <w:t>Nội dung sửa</w:t>
+            </w:r>
+          </w:p>
+        </w:tc>
+        <w:tc>
+          <w:tcPr>
+            <w:tcW w:type="dxa" w:w="2929"/>
+          </w:tcPr>
+          <w:p>
+            <w:r/>
+            <w:r>
+              <w:rPr>
+                <w:b/>
+              </w:rPr>
+              <w:t>Vì sao</w:t>
+            </w:r>
+          </w:p>
+        </w:tc>
+      </w:tr>
+      <w:tr>
+        <w:tc>
+          <w:tcPr>
+            <w:tcW w:type="dxa" w:w="2929"/>
+          </w:tcPr>
+          <w:p>
+            <w:r>
+              <w:t>§3.6</w:t>
+            </w:r>
+          </w:p>
+        </w:tc>
+        <w:tc>
+          <w:tcPr>
+            <w:tcW w:type="dxa" w:w="2929"/>
+          </w:tcPr>
+          <w:p>
+            <w:r>
+              <w:t>Bỏ câu "Original dùng weighted BPR, Active dùng BPR chuẩn"; công thức (3.31) giữ nguyên nhưng được mô tả đúng vai trò là ablation</w:t>
+            </w:r>
+          </w:p>
+        </w:tc>
+        <w:tc>
+          <w:tcPr>
+            <w:tcW w:type="dxa" w:w="2929"/>
+          </w:tcPr>
+          <w:p>
+            <w:r>
+              <w:t>Code mới chạy BPR chuẩn cho toàn bộ ma trận; có assertion chặn weighted_bpr khỏi ma trận chính</w:t>
+            </w:r>
+          </w:p>
+        </w:tc>
+      </w:tr>
+      <w:tr>
+        <w:tc>
+          <w:tcPr>
+            <w:tcW w:type="dxa" w:w="2929"/>
+          </w:tcPr>
+          <w:p>
+            <w:r>
+              <w:t>§3.4</w:t>
+            </w:r>
+          </w:p>
+        </w:tc>
+        <w:tc>
+          <w:tcPr>
+            <w:tcW w:type="dxa" w:w="2929"/>
+          </w:tcPr>
+          <w:p>
+            <w:r>
+              <w:t>Bỏ câu "λ=0.01 được lựa chọn trên tập xác thực"; thay bằng hai thiết lập λ=0.01 và λ=0.05</w:t>
+            </w:r>
+          </w:p>
+        </w:tc>
+        <w:tc>
+          <w:tcPr>
+            <w:tcW w:type="dxa" w:w="2929"/>
+          </w:tcPr>
+          <w:p>
+            <w:r>
+              <w:t>Việc dò chưa từng xảy ra với λ=0.01; λ=0.01 kế thừa từ công trình trước</w:t>
+            </w:r>
+          </w:p>
+        </w:tc>
+      </w:tr>
+      <w:tr>
+        <w:tc>
+          <w:tcPr>
+            <w:tcW w:type="dxa" w:w="2929"/>
+          </w:tcPr>
+          <w:p>
+            <w:r>
+              <w:t>§3.4</w:t>
+            </w:r>
+          </w:p>
+        </w:tc>
+        <w:tc>
+          <w:tcPr>
+            <w:tcW w:type="dxa" w:w="2929"/>
+          </w:tcPr>
+          <w:p>
+            <w:r>
+              <w:t>Thêm Bảng 3.6 là kết quả quét λ thật trên tập xác thực</w:t>
+            </w:r>
+          </w:p>
+        </w:tc>
+        <w:tc>
+          <w:tcPr>
+            <w:tcW w:type="dxa" w:w="2929"/>
+          </w:tcPr>
+          <w:p>
+            <w:r>
+              <w:t>Thay lời khẳng định bằng bằng chứng đo được; đỉnh nằm tại λ=0.05 ở cả hai cohort</w:t>
+            </w:r>
+          </w:p>
+        </w:tc>
+      </w:tr>
+      <w:tr>
+        <w:tc>
+          <w:tcPr>
+            <w:tcW w:type="dxa" w:w="2929"/>
+          </w:tcPr>
+          <w:p>
+            <w:r>
+              <w:t>§3.4</w:t>
+            </w:r>
+          </w:p>
+        </w:tc>
+        <w:tc>
+          <w:tcPr>
+            <w:tcW w:type="dxa" w:w="2929"/>
+          </w:tcPr>
+          <w:p>
+            <w:r>
+              <w:t>Giới thiệu mô hình thứ sáu BT-DKGRec-GCN (λ=0.05)</w:t>
+            </w:r>
+          </w:p>
+        </w:tc>
+        <w:tc>
+          <w:tcPr>
+            <w:tcW w:type="dxa" w:w="2929"/>
+          </w:tcPr>
+          <w:p>
+            <w:r>
+              <w:t>Mô hình này có trong mọi bảng Chương 4 nhưng chưa từng được nêu ở Chương 3</w:t>
+            </w:r>
+          </w:p>
+        </w:tc>
+      </w:tr>
+      <w:tr>
+        <w:tc>
+          <w:tcPr>
+            <w:tcW w:type="dxa" w:w="2929"/>
+          </w:tcPr>
+          <w:p>
+            <w:r>
+              <w:t>§3.5.2</w:t>
+            </w:r>
+          </w:p>
+        </w:tc>
+        <w:tc>
+          <w:tcPr>
+            <w:tcW w:type="dxa" w:w="2929"/>
+          </w:tcPr>
+          <w:p>
+            <w:r>
+              <w:t>Thêm hệ quả của chuẩn hoá đối xứng: với visitor bậc 1, W(u,i) bị triệt tiêu; 79.6% visitor Original thuộc loại đó</w:t>
+            </w:r>
+          </w:p>
+        </w:tc>
+        <w:tc>
+          <w:tcPr>
+            <w:tcW w:type="dxa" w:w="2929"/>
+          </w:tcPr>
+          <w:p>
+            <w:r>
+              <w:t>Đặt ở đây thì đây là dự đoán của lý thuyết và Chương 4 xác nhận; để Chương 4 nói lần đầu thì nó đọc như lời bào chữa</w:t>
+            </w:r>
+          </w:p>
+        </w:tc>
+      </w:tr>
+      <w:tr>
+        <w:tc>
+          <w:tcPr>
+            <w:tcW w:type="dxa" w:w="2929"/>
+          </w:tcPr>
+          <w:p>
+            <w:r>
+              <w:t>§3.8</w:t>
+            </w:r>
+          </w:p>
+        </w:tc>
+        <w:tc>
+          <w:tcPr>
+            <w:tcW w:type="dxa" w:w="2929"/>
+          </w:tcPr>
+          <w:p>
+            <w:r>
+              <w:t>Thêm early stopping: tối đa 1000 epoch, đánh giá mỗi 5 epoch, patience 20, riêng cohort Active là 50 và đặt ở cấp cohort</w:t>
+            </w:r>
+          </w:p>
+        </w:tc>
+        <w:tc>
+          <w:tcPr>
+            <w:tcW w:type="dxa" w:w="2929"/>
+          </w:tcPr>
+          <w:p>
+            <w:r>
+              <w:t>v11 mô tả một quy trình huấn luyện không có điểm dừng</w:t>
+            </w:r>
+          </w:p>
+        </w:tc>
+      </w:tr>
+      <w:tr>
+        <w:tc>
+          <w:tcPr>
+            <w:tcW w:type="dxa" w:w="2929"/>
+          </w:tcPr>
+          <w:p>
+            <w:r>
+              <w:t>§3.8</w:t>
+            </w:r>
+          </w:p>
+        </w:tc>
+        <w:tc>
+          <w:tcPr>
+            <w:tcW w:type="dxa" w:w="2929"/>
+          </w:tcPr>
+          <w:p>
+            <w:r>
+              <w:t>Thêm ba seed 2020, 2021, 2022; thêm curves.csv; thêm phân tầng warm theo bậc</w:t>
+            </w:r>
+          </w:p>
+        </w:tc>
+        <w:tc>
+          <w:tcPr>
+            <w:tcW w:type="dxa" w:w="2929"/>
+          </w:tcPr>
+          <w:p>
+            <w:r>
+              <w:t>Hai lỗ hổng nặng nhất của v11 đã được khắc phục nhưng tài liệu chưa phản ánh</w:t>
+            </w:r>
+          </w:p>
+        </w:tc>
+      </w:tr>
+      <w:tr>
+        <w:tc>
+          <w:tcPr>
+            <w:tcW w:type="dxa" w:w="2929"/>
+          </w:tcPr>
+          <w:p>
+            <w:r>
+              <w:t>§3.3.3</w:t>
+            </w:r>
+          </w:p>
+        </w:tc>
+        <w:tc>
+          <w:tcPr>
+            <w:tcW w:type="dxa" w:w="2929"/>
+          </w:tcPr>
+          <w:p>
+            <w:r>
+              <w:t>Nêu rõ 10 assertion chống rò rỉ đang chạy trong pipeline</w:t>
+            </w:r>
+          </w:p>
+        </w:tc>
+        <w:tc>
+          <w:tcPr>
+            <w:tcW w:type="dxa" w:w="2929"/>
+          </w:tcPr>
+          <w:p>
+            <w:r>
+              <w:t>v11 chỉ nói "kiểm tra tính hợp lệ", giấu mất điểm mạnh nhất của bản dựng lại</w:t>
+            </w:r>
+          </w:p>
+        </w:tc>
+      </w:tr>
+      <w:tr>
+        <w:tc>
+          <w:tcPr>
+            <w:tcW w:type="dxa" w:w="2929"/>
+          </w:tcPr>
+          <w:p>
+            <w:r>
+              <w:t>Bảng 3.4</w:t>
+            </w:r>
+          </w:p>
+        </w:tc>
+        <w:tc>
+          <w:tcPr>
+            <w:tcW w:type="dxa" w:w="2929"/>
+          </w:tcPr>
+          <w:p>
+            <w:r>
+              <w:t>Ô "Lọc thuộc tính": thay mô tả mơ hồ bằng ngưỡng thật (dưới 5 lần, tối đa 50.000 node, bỏ categoryid và available)</w:t>
+            </w:r>
+          </w:p>
+        </w:tc>
+        <w:tc>
+          <w:tcPr>
+            <w:tcW w:type="dxa" w:w="2929"/>
+          </w:tcPr>
+          <w:p>
+            <w:r>
+              <w:t>Người đọc không tái lập được từ một mô tả mơ hồ</w:t>
+            </w:r>
+          </w:p>
+        </w:tc>
+      </w:tr>
+      <w:tr>
+        <w:tc>
+          <w:tcPr>
+            <w:tcW w:type="dxa" w:w="2929"/>
+          </w:tcPr>
+          <w:p>
+            <w:r>
+              <w:t>§3.7.2</w:t>
+            </w:r>
+          </w:p>
+        </w:tc>
+        <w:tc>
+          <w:tcPr>
+            <w:tcW w:type="dxa" w:w="2929"/>
+          </w:tcPr>
+          <w:p>
+            <w:r>
+              <w:t>Ứng dụng đọc bộ tệp CSV xuất ra thay vì truy vấn Neo4j trực tiếp; bỏ mô tả "hai chế độ"</w:t>
+            </w:r>
+          </w:p>
+        </w:tc>
+        <w:tc>
+          <w:tcPr>
+            <w:tcW w:type="dxa" w:w="2929"/>
+          </w:tcPr>
+          <w:p>
+            <w:r>
+              <w:t>Mô tả cũ không khớp với ứng dụng đã hiện thực</w:t>
+            </w:r>
+          </w:p>
+        </w:tc>
+      </w:tr>
+      <w:tr>
+        <w:tc>
+          <w:tcPr>
+            <w:tcW w:type="dxa" w:w="2929"/>
+          </w:tcPr>
+          <w:p>
+            <w:r>
+              <w:t>§3.7.2</w:t>
+            </w:r>
+          </w:p>
+        </w:tc>
+        <w:tc>
+          <w:tcPr>
+            <w:tcW w:type="dxa" w:w="2929"/>
+          </w:tcPr>
+          <w:p>
+            <w:r>
+              <w:t>Thêm kết quả kiểm nhất quán hai lớp: 1.570.409 cặp từ 2.024.042 sự kiện, sai khác lớn nhất bằng 0</w:t>
+            </w:r>
+          </w:p>
+        </w:tc>
+        <w:tc>
+          <w:tcPr>
+            <w:tcW w:type="dxa" w:w="2929"/>
+          </w:tcPr>
+          <w:p>
+            <w:r>
+              <w:t>Bằng chứng kiểm chứng được, thay cho lời mô tả suông</w:t>
+            </w:r>
+          </w:p>
+        </w:tc>
+      </w:tr>
+    </w:tbl>
+    <w:p>
+      <w:pPr/>
+    </w:p>
     <w:tbl>
       <w:tblPr>
         <w:tblpPr w:leftFromText="180" w:rightFromText="180" w:vertAnchor="page" w:horzAnchor="margin" w:tblpXSpec="center" w:tblpY="1631"/>
@@ -8254,6 +8681,9 @@
         <w:pStyle w:val="ListBullet"/>
       </w:pPr>
       <w:r>
+        <w:rPr>
+          <w:highlight w:val="yellow"/>
+        </w:rPr>
         <w:t>Bảng 3.6. Kết quả quét hệ số suy giảm λ trên tập xác thực</w:t>
       </w:r>
     </w:p>
@@ -14767,6 +15197,9 @@
           </w:tcPr>
           <w:p>
             <w:r>
+              <w:rPr>
+                <w:highlight w:val="yellow"/>
+              </w:rPr>
               <w:t>Property/value xuất hiện dưới 5 lần bị loại; số node property=value giữ lại tối đa 50.000 node phổ biến nhất; hai trường categoryid và available không tạo node property vì đã được biểu diễn bằng quan hệ riêng</w:t>
             </w:r>
           </w:p>
@@ -18085,6 +18518,9 @@
         <w:jc w:val="both"/>
       </w:pPr>
       <w:r>
+        <w:rPr>
+          <w:highlight w:val="yellow"/>
+        </w:rPr>
         <w:t>Các điều kiện trên được cài đặt thành assertion chạy trong pipeline chứ không chỉ được phát biểu trong tài liệu. Các assertion kiểm tra rằng split theo thời gian không chồng lấn; ánh xạ định danh chỉ sinh từ train; side information chỉ nhận bản ghi có timestamp không vượt quá mốc kết thúc train, và với item có nhiều bản ghi thì bản ghi mới nhất còn hợp lệ được chọn; mỗi item chỉ nhận một category; chỉ số node nằm trong phạm vi ánh xạ; tập item ứng viên là tập con của tập item train; mẫu âm chỉ được lấy từ tập item train; và bước chọn mô hình chỉ đọc chỉ số của tập xác thực. Khi một assertion không thỏa, pipeline dừng ngay tại bước đó; các assertion không được tắt để pipeline chạy qua, vì một lần tắt sẽ làm mọi kết quả sinh ra sau đó không còn kiểm chứng được.</w:t>
       </w:r>
     </w:p>
@@ -18827,6 +19263,7 @@
       <w:r>
         <w:rPr>
           <w:rFonts w:cs="Times New Roman"/>
+          <w:highlight w:val="yellow"/>
         </w:rPr>
         <w:t>Đề tài báo cáo hai thiết lập của hệ số suy giảm. Thiết lập thứ nhất dùng λ=0.01, là giá trị kế thừa từ các công trình multi-behavior trước đó và không qua bước dò trên dữ liệu của đề tài. Thiết lập thứ hai dùng λ=0.05, là giá trị được chọn sau khi quét λ trên tập xác thực. Các trọng số hành vi giữ nguyên ở cả hai thiết lập:</w:t>
       </w:r>
@@ -19175,6 +19612,9 @@
         <w:jc w:val="both"/>
       </w:pPr>
       <w:r>
+        <w:rPr>
+          <w:highlight w:val="yellow"/>
+        </w:rPr>
         <w:t>Giá trị λ được dò bằng cách quét trên tập xác thực, đo bằng AUC của trọng số cạnh khi dự báo tương tác mục tiêu; phép đo này đánh giá trực tiếp chất lượng của trọng số trước khi đưa vào huấn luyện, do đó không tiêu tốn ngân sách GPU cho từng giá trị λ và không đọc tập test.</w:t>
       </w:r>
     </w:p>
@@ -19185,6 +19625,7 @@
       <w:r>
         <w:rPr>
           <w:b/>
+          <w:highlight w:val="yellow"/>
         </w:rPr>
         <w:t>Bảng 3.6. Kết quả quét hệ số suy giảm λ trên tập xác thực</w:t>
       </w:r>
@@ -19206,10 +19647,15 @@
             <w:tcW w:type="dxa" w:w="2929"/>
           </w:tcPr>
           <w:p>
-            <w:r/>
+            <w:r>
+              <w:rPr>
+                <w:highlight w:val="yellow"/>
+              </w:rPr>
+            </w:r>
             <w:r>
               <w:rPr>
                 <w:b/>
+                <w:highlight w:val="yellow"/>
               </w:rPr>
               <w:t>λ</w:t>
             </w:r>
@@ -19220,10 +19666,15 @@
             <w:tcW w:type="dxa" w:w="2929"/>
           </w:tcPr>
           <w:p>
-            <w:r/>
+            <w:r>
+              <w:rPr>
+                <w:highlight w:val="yellow"/>
+              </w:rPr>
+            </w:r>
             <w:r>
               <w:rPr>
                 <w:b/>
+                <w:highlight w:val="yellow"/>
               </w:rPr>
               <w:t>AUC trên tập xác thực (Original)</w:t>
             </w:r>
@@ -19234,10 +19685,15 @@
             <w:tcW w:type="dxa" w:w="2929"/>
           </w:tcPr>
           <w:p>
-            <w:r/>
+            <w:r>
+              <w:rPr>
+                <w:highlight w:val="yellow"/>
+              </w:rPr>
+            </w:r>
             <w:r>
               <w:rPr>
                 <w:b/>
+                <w:highlight w:val="yellow"/>
               </w:rPr>
               <w:t>AUC trên tập xác thực (Active)</w:t>
             </w:r>
@@ -19251,6 +19707,9 @@
           </w:tcPr>
           <w:p>
             <w:r>
+              <w:rPr>
+                <w:highlight w:val="yellow"/>
+              </w:rPr>
               <w:t>0.000</w:t>
             </w:r>
           </w:p>
@@ -19261,6 +19720,9 @@
           </w:tcPr>
           <w:p>
             <w:r>
+              <w:rPr>
+                <w:highlight w:val="yellow"/>
+              </w:rPr>
               <w:t>0.7862</w:t>
             </w:r>
           </w:p>
@@ -19271,6 +19733,9 @@
           </w:tcPr>
           <w:p>
             <w:r>
+              <w:rPr>
+                <w:highlight w:val="yellow"/>
+              </w:rPr>
               <w:t>0.7637</w:t>
             </w:r>
           </w:p>
@@ -19283,6 +19748,9 @@
           </w:tcPr>
           <w:p>
             <w:r>
+              <w:rPr>
+                <w:highlight w:val="yellow"/>
+              </w:rPr>
               <w:t>0.010</w:t>
             </w:r>
           </w:p>
@@ -19293,6 +19761,9 @@
           </w:tcPr>
           <w:p>
             <w:r>
+              <w:rPr>
+                <w:highlight w:val="yellow"/>
+              </w:rPr>
               <w:t>0.9045</w:t>
             </w:r>
           </w:p>
@@ -19303,6 +19774,9 @@
           </w:tcPr>
           <w:p>
             <w:r>
+              <w:rPr>
+                <w:highlight w:val="yellow"/>
+              </w:rPr>
               <w:t>0.8566</w:t>
             </w:r>
           </w:p>
@@ -19315,6 +19789,9 @@
           </w:tcPr>
           <w:p>
             <w:r>
+              <w:rPr>
+                <w:highlight w:val="yellow"/>
+              </w:rPr>
               <w:t>0.020</w:t>
             </w:r>
           </w:p>
@@ -19325,6 +19802,9 @@
           </w:tcPr>
           <w:p>
             <w:r>
+              <w:rPr>
+                <w:highlight w:val="yellow"/>
+              </w:rPr>
               <w:t>0.9180</w:t>
             </w:r>
           </w:p>
@@ -19335,6 +19815,9 @@
           </w:tcPr>
           <w:p>
             <w:r>
+              <w:rPr>
+                <w:highlight w:val="yellow"/>
+              </w:rPr>
               <w:t>0.8825</w:t>
             </w:r>
           </w:p>
@@ -19347,6 +19830,9 @@
           </w:tcPr>
           <w:p>
             <w:r>
+              <w:rPr>
+                <w:highlight w:val="yellow"/>
+              </w:rPr>
               <w:t>0.050</w:t>
             </w:r>
           </w:p>
@@ -19357,6 +19843,9 @@
           </w:tcPr>
           <w:p>
             <w:r>
+              <w:rPr>
+                <w:highlight w:val="yellow"/>
+              </w:rPr>
               <w:t>0.9185</w:t>
             </w:r>
           </w:p>
@@ -19367,6 +19856,9 @@
           </w:tcPr>
           <w:p>
             <w:r>
+              <w:rPr>
+                <w:highlight w:val="yellow"/>
+              </w:rPr>
               <w:t>0.9012</w:t>
             </w:r>
           </w:p>
@@ -19379,6 +19871,9 @@
           </w:tcPr>
           <w:p>
             <w:r>
+              <w:rPr>
+                <w:highlight w:val="yellow"/>
+              </w:rPr>
               <w:t>0.100</w:t>
             </w:r>
           </w:p>
@@ -19389,6 +19884,9 @@
           </w:tcPr>
           <w:p>
             <w:r>
+              <w:rPr>
+                <w:highlight w:val="yellow"/>
+              </w:rPr>
               <w:t>0.9069</w:t>
             </w:r>
           </w:p>
@@ -19399,6 +19897,9 @@
           </w:tcPr>
           <w:p>
             <w:r>
+              <w:rPr>
+                <w:highlight w:val="yellow"/>
+              </w:rPr>
               <w:t>0.8963</w:t>
             </w:r>
           </w:p>
@@ -19410,6 +19911,9 @@
         <w:jc w:val="both"/>
       </w:pPr>
       <w:r>
+        <w:rPr>
+          <w:highlight w:val="yellow"/>
+        </w:rPr>
         <w:t>Đỉnh nằm tại λ=0.05 trên cả hai cohort, trong khi λ=0.01 nằm dưới đỉnh ở cả hai. Trên cửa sổ train dài 97 ngày, λ=0.01 làm trọng số của một tương tác giảm từ 1.00 xuống 0.38, còn λ=0.05 làm trọng số giảm từ 1.00 xuống 0.008; thiết lập thứ hai vì vậy nhấn mạnh tính gần đây mạnh hơn nhiều. Đề tài giữ cả hai thiết lập trong bảng kết quả, ký hiệu là BT-DKGRec-GCN (λ=0.01) và BT-DKGRec-GCN (λ=0.05), để người đọc thấy được cả cấu hình trước và sau khi dò tham số; hai mô hình khác nhau đúng một tham số là lambda_decay và dùng chung toàn bộ phần còn lại của cấu hình.</w:t>
       </w:r>
     </w:p>
@@ -21372,6 +21876,9 @@
         <w:jc w:val="both"/>
       </w:pPr>
       <w:r>
+        <w:rPr>
+          <w:highlight w:val="yellow"/>
+        </w:rPr>
         <w:t>Phép chuẩn hóa này có một hệ quả cần được nêu trước khi đọc kết quả thực nghiệm. Với một visitor chỉ có duy nhất một cạnh trong graph train, bậc có trọng số của node đó bằng đúng trọng số của cạnh đó, nên thừa số W(u,i) xuất hiện đồng thời ở tử số và ở mẫu số của phép chuẩn hóa và bị triệt tiêu; embedding thu được không phụ thuộc vào giá trị của W(u,i), và thứ hạng Top-K sinh ra cho visitor đó trùng với thứ hạng mà một mô hình không dùng behavior-time weighting sinh ra. Trong tập huấn luyện Original, 79.6% visitor có đúng một cạnh, do đó behavior-time weighting chỉ có thể tác động lên phần visitor còn lại. Đây là lý do đề tài báo cáo nhóm warm tách thêm theo bậc của visitor trong train, và là ràng buộc cần tính đến khi diễn giải mức chênh lệch giữa BT-DKGRec-GCN và Static KG-GCN ở Chương 4.</w:t>
       </w:r>
     </w:p>
@@ -22486,6 +22993,7 @@
       <w:r>
         <w:rPr>
           <w:rFonts w:cs="Times New Roman"/>
+          <w:highlight w:val="yellow"/>
         </w:rPr>
         <w:t>Ngoài BPR chuẩn, đề tài định nghĩa thêm một biến thể có trọng số, trong đó trọng số dương của cặp visitor-item được dùng khi lấy trung bình loss trên mini-batch,</w:t>
       </w:r>
@@ -23085,6 +23593,7 @@
       <w:r>
         <w:rPr>
           <w:rFonts w:cs="Times New Roman"/>
+          <w:highlight w:val="yellow"/>
         </w:rPr>
         <w:t>trong đó q(u,i+) là trọng số dương lấy từ cạnh tương tác. Biến thể này chỉ được dùng trong thí nghiệm loại bỏ thành phần; toàn bộ ma trận thực nghiệm gồm sáu mô hình, ba seed và hai cohort đều được huấn luyện bằng BPR chuẩn theo công thức (3.30). Ràng buộc này được cài thành assertion trong lớp cấu hình, nên một cấu hình đặt loss là weighted_bpr trong ma trận chính sẽ dừng ngay khi nạp cấu hình thay vì chạy đến cuối rồi cho ra một bảng không so sánh được. Lý do là trọng số hành vi-thời gian đã tham gia ở bước xây dựng adjacency và ở phép lan truyền; đưa trọng số vào loss thêm một lần nữa sẽ làm hai cấu hình khác nhau ở hai biến thay vì một, và mọi chênh lệch đo được sẽ không quy về được cho riêng behavior-time weighting.</w:t>
       </w:r>
@@ -23332,6 +23841,7 @@
       <w:r>
         <w:rPr>
           <w:rFonts w:cs="Times New Roman"/>
+          <w:highlight w:val="yellow"/>
         </w:rPr>
         <w:t>Ứng dụng cho phép chọn người dùng, xem lịch sử tương tác, kiểm tra trọng số cạnh hành vi-thời gian, quan sát đồ thị con Visitor-Item-Category/Property và đối chiếu các chỉ số thực nghiệm; ứng dụng đọc trực tiếp bộ tệp xuất của đồ thị cùng tệp kết quả Top-K của lần chạy, và được tổ chức thành ba phần tương ứng với lớp lưu vết, lớp chiếu và danh sách Top-K.</w:t>
       </w:r>
@@ -23346,6 +23856,7 @@
       <w:r>
         <w:rPr>
           <w:rFonts w:cs="Times New Roman"/>
+          <w:highlight w:val="yellow"/>
         </w:rPr>
         <w:t>Bước xuất dữ liệu sinh ra một bộ tệp CSV theo lược đồ của đồ thị, gồm node visitor, item, category, property, node sự kiện của lớp lưu vết và cạnh visitor-item đã tổng hợp của lớp chiếu; bộ tệp có hai phạm vi, một phạm vi giới hạn ở các visitor được đánh giá dùng cho trình diễn và một phạm vi đầy đủ dùng cho kiểm tra lược đồ. Bộ tệp này vừa là dữ liệu nạp vào Neo4j vừa là nguồn đọc trực tiếp của ứng dụng nguyên mẫu, nên phần trình diễn không phụ thuộc vào một dịch vụ cơ sở dữ liệu đang chạy. Việc chỉ sử dụng phạm vi huấn luyện giúp phần trình diễn không đưa hành vi thuộc tập xác thực hoặc tập kiểm thử vào đồ thị dùng để minh họa suy luận. Tính nhất quán giữa hai lớp được kiểm bằng một assertion so tổng trọng số sự kiện của lớp lưu vết với trọng số cạnh của lớp chiếu trên từng cặp visitor-item; trên bản xuất của cohort Original, phép kiểm đối chiếu 1.570.409 cặp sinh từ 2.024.042 sự kiện và sai khác tương đối lớn nhất bằng 0.</w:t>
       </w:r>
@@ -23501,6 +24012,7 @@
       <w:r>
         <w:rPr>
           <w:rFonts w:cs="Times New Roman"/>
+          <w:highlight w:val="yellow"/>
         </w:rPr>
         <w:t>Huấn luyện mô hình đối chứng và BT-DKGRec-GCN trên cùng một ngân sách, với ba seed 2020, 2021 và 2022.</w:t>
       </w:r>
@@ -23539,6 +24051,7 @@
       <w:r>
         <w:rPr>
           <w:rFonts w:cs="Times New Roman"/>
+          <w:highlight w:val="yellow"/>
         </w:rPr>
         <w:t>Báo cáo test warm như kết quả cuối, kèm phân tách theo bậc của visitor trong tập huấn luyện.</w:t>
       </w:r>
@@ -23586,6 +24099,9 @@
         <w:jc w:val="both"/>
       </w:pPr>
       <w:r>
+        <w:rPr>
+          <w:highlight w:val="yellow"/>
+        </w:rPr>
         <w:t>Ngân sách huấn luyện được xác định bằng early stopping trên tập xác thực thay vì bằng một số epoch cố định. Mỗi mô hình được phép chạy tối đa 1000 epoch, được đánh giá trên tập xác thực sau mỗi 5 epoch, và dừng khi chỉ số giám sát NDCG@20 không cải thiện sau 20 lần đánh giá liên tiếp; riêng cohort Active dùng ngưỡng 50 lần vì đường xác thực của cohort này không đơn điệu ở mọi mô hình, nên một ngưỡng nhỏ hơn sẽ dừng một số mô hình sớm hơn các mô hình khác và làm mất tính công bằng của so sánh. Ngưỡng được đặt ở cấp cohort chứ không ở cấp mô hình, nên trong cùng một cohort mọi mô hình nhận cùng một ngân sách. Toàn bộ quá trình huấn luyện được ghi lại theo từng epoch trong tệp curves.csv của mỗi lần chạy, gồm loss ở mọi epoch và toàn bộ khối chỉ số xác thực ở các epoch được đánh giá; nhờ vậy có thể kiểm tra lại rằng mô hình đối chứng đã hội tụ chứ không bị dừng sớm. Kết quả cuối được báo cáo dưới dạng trung bình và độ lệch chuẩn trên ba seed.</w:t>
       </w:r>
     </w:p>
@@ -23781,6 +24297,9 @@
         <w:pStyle w:val="ListBullet"/>
       </w:pPr>
       <w:r>
+        <w:rPr>
+          <w:highlight w:val="yellow"/>
+        </w:rPr>
         <w:t>Không chọn seed và không loại bỏ lần chạy: script sinh bảng đọc toàn bộ thư mục kết quả.</w:t>
       </w:r>
     </w:p>

</xml_diff>